<commit_message>
release: promote accepted TEST02 as V1.53
</commit_message>
<xml_diff>
--- a/Manual/HOTA_NEW_HERO_V1.53_HERO_HANDBOOK.docx
+++ b/Manual/HOTA_NEW_HERO_V1.53_HERO_HANDBOOK.docx
@@ -3399,7 +3399,7 @@
           <w:color w:val="172235"/>
           <w:sz w:val="18"/>
         </w:rPr>
-        <w:t>战争机器——弩车、加农炮和投石车每次原生行动额外射击 1 次；胜利后修复战前拥有且被摧毁的战争机器。补给车与炮术、弹道术还能继续解锁攻击、防御、射程和行动优先级强化。</w:t>
+        <w:t>战争机器——弩车、加农炮和投石车每次原生行动额外射击 1 次；胜利后按现有规则修复战前拥有且被摧毁的战争机器。补给车与炮术、弹道术还能继续解锁攻击、防御、射程和行动优先级强化。守城战中被摧毁的急救帐篷和补给车不恢复。</w:t>
       </w:r>
     </w:p>
     <w:p>
@@ -3421,7 +3421,7 @@
           <w:color w:val="172235"/>
           <w:sz w:val="18"/>
         </w:rPr>
-        <w:t>4–5 地狱猎犬；携带弩车和补给车。</w:t>
+        <w:t>正常初始为 4–5 地狱猎犬；撤退或战败后的原生最低军队为 1 小恶魔；静态选将预览可能沿用未修改的默认模板；携带弩车和补给车。</w:t>
       </w:r>
     </w:p>
     <w:p>
@@ -3524,7 +3524,7 @@
     </w:p>
     <w:p>
       <w:pPr>
-        <w:spacing w:after="50" w:line="259" w:lineRule="auto"/>
+        <w:spacing w:after="0" w:line="240" w:lineRule="auto"/>
         <w:numPr>
           <w:ilvl w:val="0"/>
           <w:numId w:val="10"/>
@@ -3535,7 +3535,7 @@
           <w:rFonts w:ascii="Microsoft YaHei" w:hAnsi="Microsoft YaHei" w:eastAsia="Microsoft YaHei"/>
           <w:b/>
           <w:color w:val="172235"/>
-          <w:sz w:val="18"/>
+          <w:sz w:val="16"/>
         </w:rPr>
         <w:t>额外射击：</w:t>
       </w:r>
@@ -3543,14 +3543,14 @@
         <w:rPr>
           <w:rFonts w:ascii="Microsoft YaHei" w:hAnsi="Microsoft YaHei" w:eastAsia="Microsoft YaHei"/>
           <w:color w:val="172235"/>
-          <w:sz w:val="18"/>
+          <w:sz w:val="16"/>
         </w:rPr>
         <w:t>弩车、加农炮、投石车每次原生行动额外射击 1 次；这是同一行动块的扩展，不是额外回合。</w:t>
       </w:r>
     </w:p>
     <w:p>
       <w:pPr>
-        <w:spacing w:after="50" w:line="259" w:lineRule="auto"/>
+        <w:spacing w:after="0" w:line="240" w:lineRule="auto"/>
         <w:numPr>
           <w:ilvl w:val="0"/>
           <w:numId w:val="10"/>
@@ -3561,7 +3561,7 @@
           <w:rFonts w:ascii="Microsoft YaHei" w:hAnsi="Microsoft YaHei" w:eastAsia="Microsoft YaHei"/>
           <w:b/>
           <w:color w:val="172235"/>
-          <w:sz w:val="18"/>
+          <w:sz w:val="16"/>
         </w:rPr>
         <w:t>胜利修复：</w:t>
       </w:r>
@@ -3569,14 +3569,14 @@
         <w:rPr>
           <w:rFonts w:ascii="Microsoft YaHei" w:hAnsi="Microsoft YaHei" w:eastAsia="Microsoft YaHei"/>
           <w:color w:val="172235"/>
-          <w:sz w:val="18"/>
+          <w:sz w:val="16"/>
         </w:rPr>
-        <w:t>只修复战前已经拥有、战斗中被摧毁的战争机器；失败、撤退或投降不触发，也不会凭空生成机器。</w:t>
+        <w:t>只修复战前已经拥有、战斗中被摧毁的战争机器；失败、撤退或投降不触发，也不会凭空生成机器。守城战中被摧毁的急救帐篷和补给车不恢复。</w:t>
       </w:r>
     </w:p>
     <w:p>
       <w:pPr>
-        <w:spacing w:after="50" w:line="259" w:lineRule="auto"/>
+        <w:spacing w:after="0" w:line="240" w:lineRule="auto"/>
         <w:numPr>
           <w:ilvl w:val="0"/>
           <w:numId w:val="10"/>
@@ -3587,7 +3587,7 @@
           <w:rFonts w:ascii="Microsoft YaHei" w:hAnsi="Microsoft YaHei" w:eastAsia="Microsoft YaHei"/>
           <w:b/>
           <w:color w:val="172235"/>
-          <w:sz w:val="18"/>
+          <w:sz w:val="16"/>
         </w:rPr>
         <w:t>补给车受击上限：</w:t>
       </w:r>
@@ -3595,14 +3595,14 @@
         <w:rPr>
           <w:rFonts w:ascii="Microsoft YaHei" w:hAnsi="Microsoft YaHei" w:eastAsia="Microsoft YaHei"/>
           <w:color w:val="172235"/>
-          <w:sz w:val="18"/>
+          <w:sz w:val="16"/>
         </w:rPr>
         <w:t>每次物理命中最多损失其当前最大生命值的 40%，日志与最终伤害保持一致。</w:t>
       </w:r>
     </w:p>
     <w:p>
       <w:pPr>
-        <w:spacing w:after="50" w:line="259" w:lineRule="auto"/>
+        <w:spacing w:after="0" w:line="240" w:lineRule="auto"/>
         <w:numPr>
           <w:ilvl w:val="0"/>
           <w:numId w:val="10"/>
@@ -3613,7 +3613,7 @@
           <w:rFonts w:ascii="Microsoft YaHei" w:hAnsi="Microsoft YaHei" w:eastAsia="Microsoft YaHei"/>
           <w:b/>
           <w:color w:val="172235"/>
-          <w:sz w:val="18"/>
+          <w:sz w:val="16"/>
         </w:rPr>
         <w:t>初级弹道术：</w:t>
       </w:r>
@@ -3621,14 +3621,14 @@
         <w:rPr>
           <w:rFonts w:ascii="Microsoft YaHei" w:hAnsi="Microsoft YaHei" w:eastAsia="Microsoft YaHei"/>
           <w:color w:val="172235"/>
-          <w:sz w:val="18"/>
+          <w:sz w:val="16"/>
         </w:rPr>
         <w:t>补给车存活时，普通射手、弩车和加农炮攻击力 +4。</w:t>
       </w:r>
     </w:p>
     <w:p>
       <w:pPr>
-        <w:spacing w:after="50" w:line="259" w:lineRule="auto"/>
+        <w:spacing w:after="0" w:line="240" w:lineRule="auto"/>
         <w:numPr>
           <w:ilvl w:val="0"/>
           <w:numId w:val="10"/>
@@ -3639,7 +3639,7 @@
           <w:rFonts w:ascii="Microsoft YaHei" w:hAnsi="Microsoft YaHei" w:eastAsia="Microsoft YaHei"/>
           <w:b/>
           <w:color w:val="172235"/>
-          <w:sz w:val="18"/>
+          <w:sz w:val="16"/>
         </w:rPr>
         <w:t>中级及以上炮术：</w:t>
       </w:r>
@@ -3647,14 +3647,14 @@
         <w:rPr>
           <w:rFonts w:ascii="Microsoft YaHei" w:hAnsi="Microsoft YaHei" w:eastAsia="Microsoft YaHei"/>
           <w:color w:val="172235"/>
-          <w:sz w:val="18"/>
+          <w:sz w:val="16"/>
         </w:rPr>
         <w:t>弩车和加农炮攻击生物时按目标 50% 有效防御结算，向上取整。</w:t>
       </w:r>
     </w:p>
     <w:p>
       <w:pPr>
-        <w:spacing w:after="50" w:line="259" w:lineRule="auto"/>
+        <w:spacing w:after="0" w:line="240" w:lineRule="auto"/>
         <w:numPr>
           <w:ilvl w:val="0"/>
           <w:numId w:val="10"/>
@@ -3665,7 +3665,7 @@
           <w:rFonts w:ascii="Microsoft YaHei" w:hAnsi="Microsoft YaHei" w:eastAsia="Microsoft YaHei"/>
           <w:b/>
           <w:color w:val="172235"/>
-          <w:sz w:val="18"/>
+          <w:sz w:val="16"/>
         </w:rPr>
         <w:t>高级炮术：</w:t>
       </w:r>
@@ -3673,14 +3673,14 @@
         <w:rPr>
           <w:rFonts w:ascii="Microsoft YaHei" w:hAnsi="Microsoft YaHei" w:eastAsia="Microsoft YaHei"/>
           <w:color w:val="172235"/>
-          <w:sz w:val="18"/>
+          <w:sz w:val="16"/>
         </w:rPr>
         <w:t>弩车和加农炮攻击生物时无视射程与城墙惩罚。</w:t>
       </w:r>
     </w:p>
     <w:p>
       <w:pPr>
-        <w:spacing w:after="50" w:line="259" w:lineRule="auto"/>
+        <w:spacing w:after="0" w:line="240" w:lineRule="auto"/>
         <w:numPr>
           <w:ilvl w:val="0"/>
           <w:numId w:val="10"/>
@@ -3691,7 +3691,7 @@
           <w:rFonts w:ascii="Microsoft YaHei" w:hAnsi="Microsoft YaHei" w:eastAsia="Microsoft YaHei"/>
           <w:b/>
           <w:color w:val="172235"/>
-          <w:sz w:val="18"/>
+          <w:sz w:val="16"/>
         </w:rPr>
         <w:t>双高级大招：</w:t>
       </w:r>
@@ -3699,14 +3699,14 @@
         <w:rPr>
           <w:rFonts w:ascii="Microsoft YaHei" w:hAnsi="Microsoft YaHei" w:eastAsia="Microsoft YaHei"/>
           <w:color w:val="172235"/>
-          <w:sz w:val="18"/>
+          <w:sz w:val="16"/>
         </w:rPr>
         <w:t>同时掌握高级弹道术和高级炮术后，行动优先级为投石车 &gt; 弩车/加农炮 &gt; 箭塔 &gt; 原生候选；同级候选交回原生比较器。</w:t>
       </w:r>
     </w:p>
     <w:p>
       <w:pPr>
-        <w:spacing w:after="50" w:line="259" w:lineRule="auto"/>
+        <w:spacing w:after="0" w:line="240" w:lineRule="auto"/>
         <w:numPr>
           <w:ilvl w:val="0"/>
           <w:numId w:val="10"/>
@@ -3717,7 +3717,7 @@
           <w:rFonts w:ascii="Microsoft YaHei" w:hAnsi="Microsoft YaHei" w:eastAsia="Microsoft YaHei"/>
           <w:b/>
           <w:color w:val="172235"/>
-          <w:sz w:val="18"/>
+          <w:sz w:val="16"/>
         </w:rPr>
         <w:t>边界：</w:t>
       </w:r>
@@ -3725,35 +3725,9 @@
         <w:rPr>
           <w:rFonts w:ascii="Microsoft YaHei" w:hAnsi="Microsoft YaHei" w:eastAsia="Microsoft YaHei"/>
           <w:color w:val="172235"/>
-          <w:sz w:val="18"/>
+          <w:sz w:val="16"/>
         </w:rPr>
-        <w:t>普通射手只获得 +4 攻击；加农炮攻击城墙或工事保持 HotA 原生城防结算；急救帐篷不进入逻辑先制。</w:t>
-      </w:r>
-    </w:p>
-    <w:p>
-      <w:pPr>
-        <w:spacing w:after="50" w:line="259" w:lineRule="auto"/>
-        <w:numPr>
-          <w:ilvl w:val="0"/>
-          <w:numId w:val="10"/>
-        </w:numPr>
-      </w:pPr>
-      <w:r>
-        <w:rPr>
-          <w:rFonts w:ascii="Microsoft YaHei" w:hAnsi="Microsoft YaHei" w:eastAsia="Microsoft YaHei"/>
-          <w:b/>
-          <w:color w:val="172235"/>
-          <w:sz w:val="18"/>
-        </w:rPr>
-        <w:t>边界：</w:t>
-      </w:r>
-      <w:r>
-        <w:rPr>
-          <w:rFonts w:ascii="Microsoft YaHei" w:hAnsi="Microsoft YaHei" w:eastAsia="Microsoft YaHei"/>
-          <w:color w:val="172235"/>
-          <w:sz w:val="18"/>
-        </w:rPr>
-        <w:t>不修改速度、done、士气或回合计数，不生成额外行动块；投石车保持原生城防结构日志。</w:t>
+        <w:t>普通射手只获得 +4 攻击；加农炮攻击城墙或工事保持 HotA 原生城防结算；急救帐篷不进入逻辑先制；不修改速度、done、士气或回合计数，不生成额外行动块；投石车保持原生城防结构日志。</w:t>
       </w:r>
     </w:p>
     <w:p>
@@ -9265,7 +9239,7 @@
           <w:color w:val="172235"/>
           <w:sz w:val="18"/>
         </w:rPr>
-        <w:t>War Machines — the Ballista, Cannon, and Catapult fire one additional shot during each native action; destroyed pre-battle war machines are repaired after victory. The Ammo Cart, Artillery, and Ballistics unlock further Attack, Defense, range, and action-priority upgrades.</w:t>
+        <w:t>War Machines — the Ballista, Cannon, and Catapult fire one additional shot during each native action; destroyed pre-battle war machines are repaired after victory under the current rules. The Ammo Cart, Artillery, and Ballistics unlock further Attack, Defense, range, and action-priority upgrades. A First Aid Tent or Ammo Cart destroyed while defending a siege is not restored.</w:t>
       </w:r>
     </w:p>
     <w:p>
@@ -9287,7 +9261,7 @@
           <w:color w:val="172235"/>
           <w:sz w:val="18"/>
         </w:rPr>
-        <w:t>4–5 Hell Hounds; starts with a Ballista and Ammo Cart.</w:t>
+        <w:t>A normal new hero has 4–5 Hell Hounds; after defeat or retreat, the native minimum army is 1 Imp. The static preview may retain the unchanged template. Starts with a Ballista and Ammo Cart.</w:t>
       </w:r>
     </w:p>
     <w:p>
@@ -9390,7 +9364,7 @@
     </w:p>
     <w:p>
       <w:pPr>
-        <w:spacing w:after="50" w:line="259" w:lineRule="auto"/>
+        <w:spacing w:after="0" w:line="240" w:lineRule="auto"/>
         <w:numPr>
           <w:ilvl w:val="0"/>
           <w:numId w:val="10"/>
@@ -9400,14 +9374,14 @@
         <w:rPr>
           <w:rFonts w:ascii="Microsoft YaHei" w:hAnsi="Microsoft YaHei" w:eastAsia="Microsoft YaHei"/>
           <w:color w:val="172235"/>
-          <w:sz w:val="18"/>
+          <w:sz w:val="16"/>
         </w:rPr>
         <w:t>The Ballista, Cannon, and Catapult fire one extra shot within each native action block; no extra turn is created.</w:t>
       </w:r>
     </w:p>
     <w:p>
       <w:pPr>
-        <w:spacing w:after="50" w:line="259" w:lineRule="auto"/>
+        <w:spacing w:after="0" w:line="240" w:lineRule="auto"/>
         <w:numPr>
           <w:ilvl w:val="0"/>
           <w:numId w:val="10"/>
@@ -9417,14 +9391,14 @@
         <w:rPr>
           <w:rFonts w:ascii="Microsoft YaHei" w:hAnsi="Microsoft YaHei" w:eastAsia="Microsoft YaHei"/>
           <w:color w:val="172235"/>
-          <w:sz w:val="18"/>
+          <w:sz w:val="16"/>
         </w:rPr>
-        <w:t>Victory repairs only pre-battle machines destroyed in that battle. Defeat, retreat, or surrender does not trigger repair.</w:t>
+        <w:t>Victory repairs only pre-battle machines destroyed in that battle. Defeat, retreat, or surrender does not trigger repair. A First Aid Tent or Ammo Cart destroyed while defending a siege is not restored.</w:t>
       </w:r>
     </w:p>
     <w:p>
       <w:pPr>
-        <w:spacing w:after="50" w:line="259" w:lineRule="auto"/>
+        <w:spacing w:after="0" w:line="240" w:lineRule="auto"/>
         <w:numPr>
           <w:ilvl w:val="0"/>
           <w:numId w:val="10"/>
@@ -9434,14 +9408,14 @@
         <w:rPr>
           <w:rFonts w:ascii="Microsoft YaHei" w:hAnsi="Microsoft YaHei" w:eastAsia="Microsoft YaHei"/>
           <w:color w:val="172235"/>
-          <w:sz w:val="18"/>
+          <w:sz w:val="16"/>
         </w:rPr>
         <w:t>Each physical hit removes at most 40% of the Ammo Cart's current maximum HP.</w:t>
       </w:r>
     </w:p>
     <w:p>
       <w:pPr>
-        <w:spacing w:after="50" w:line="259" w:lineRule="auto"/>
+        <w:spacing w:after="0" w:line="240" w:lineRule="auto"/>
         <w:numPr>
           <w:ilvl w:val="0"/>
           <w:numId w:val="10"/>
@@ -9451,14 +9425,14 @@
         <w:rPr>
           <w:rFonts w:ascii="Microsoft YaHei" w:hAnsi="Microsoft YaHei" w:eastAsia="Microsoft YaHei"/>
           <w:color w:val="172235"/>
-          <w:sz w:val="18"/>
+          <w:sz w:val="16"/>
         </w:rPr>
         <w:t>With a living Ammo Cart and at least Basic Ballistics, ordinary shooters, the Ballista, and the Cannon gain +4 Attack.</w:t>
       </w:r>
     </w:p>
     <w:p>
       <w:pPr>
-        <w:spacing w:after="50" w:line="259" w:lineRule="auto"/>
+        <w:spacing w:after="0" w:line="240" w:lineRule="auto"/>
         <w:numPr>
           <w:ilvl w:val="0"/>
           <w:numId w:val="10"/>
@@ -9468,14 +9442,14 @@
         <w:rPr>
           <w:rFonts w:ascii="Microsoft YaHei" w:hAnsi="Microsoft YaHei" w:eastAsia="Microsoft YaHei"/>
           <w:color w:val="172235"/>
-          <w:sz w:val="18"/>
+          <w:sz w:val="16"/>
         </w:rPr>
         <w:t>Advanced or Expert Artillery makes the Ballista and Cannon attack creatures using 50% effective Defense, rounded up; Expert Artillery also ignores range and wall penalties.</w:t>
       </w:r>
     </w:p>
     <w:p>
       <w:pPr>
-        <w:spacing w:after="50" w:line="259" w:lineRule="auto"/>
+        <w:spacing w:after="0" w:line="240" w:lineRule="auto"/>
         <w:numPr>
           <w:ilvl w:val="0"/>
           <w:numId w:val="10"/>
@@ -9485,14 +9459,14 @@
         <w:rPr>
           <w:rFonts w:ascii="Microsoft YaHei" w:hAnsi="Microsoft YaHei" w:eastAsia="Microsoft YaHei"/>
           <w:color w:val="172235"/>
-          <w:sz w:val="18"/>
+          <w:sz w:val="16"/>
         </w:rPr>
         <w:t>With Expert Ballistics and Expert Artillery, action priority is Catapult &gt; Ballista/Cannon &gt; towers &gt; native candidates; equal-rank choices return to the native comparator.</w:t>
       </w:r>
     </w:p>
     <w:p>
       <w:pPr>
-        <w:spacing w:after="50" w:line="259" w:lineRule="auto"/>
+        <w:spacing w:after="0" w:line="240" w:lineRule="auto"/>
         <w:numPr>
           <w:ilvl w:val="0"/>
           <w:numId w:val="10"/>
@@ -9502,9 +9476,9 @@
         <w:rPr>
           <w:rFonts w:ascii="Microsoft YaHei" w:hAnsi="Microsoft YaHei" w:eastAsia="Microsoft YaHei"/>
           <w:color w:val="172235"/>
-          <w:sz w:val="18"/>
+          <w:sz w:val="16"/>
         </w:rPr>
-        <w:t>Ordinary shooters receive only +4 Attack; the Cannon retains native siege settlement against walls; the First Aid Tent never enters logical initiative.</w:t>
+        <w:t>Ordinary shooters receive only +4 Attack; the Cannon retains native siege settlement against walls; the First Aid Tent never enters logical initiative. Speed, done state, Morale, and turn counts remain native, and no extra action block is created.</w:t>
       </w:r>
     </w:p>
     <w:p>
@@ -12797,7 +12771,7 @@
           <w:color w:val="687386"/>
           <w:sz w:val="20"/>
         </w:rPr>
-        <w:t>奥蕾加寻宝术 · HOTA_NEW_HERO_V1.52</w:t>
+        <w:t>奥蕾加寻宝术 · HOTA_NEW_HERO_V1.53</w:t>
       </w:r>
     </w:p>
     <w:p>

</xml_diff>